<commit_message>
Complete AI Resume Matcher application
</commit_message>
<xml_diff>
--- a/tests/data/sample_resume.docx
+++ b/tests/data/sample_resume.docx
@@ -16,6 +16,28 @@
     <w:p/>
     <w:p>
       <w:r>
+        <w:t>Email:</w:t>
+      </w:r>
+    </w:p>
+    <w:p>
+      <w:r>
+        <w:t>john.doe@example.com</w:t>
+      </w:r>
+    </w:p>
+    <w:p/>
+    <w:p>
+      <w:r>
+        <w:t>Phone:</w:t>
+      </w:r>
+    </w:p>
+    <w:p>
+      <w:r>
+        <w:t>+8801712345678</w:t>
+      </w:r>
+    </w:p>
+    <w:p/>
+    <w:p>
+      <w:r>
         <w:t>Skills:</w:t>
       </w:r>
     </w:p>
@@ -47,7 +69,26 @@
     </w:p>
     <w:p>
       <w:r>
-        <w:t>5 years</w:t>
+        <w:t>3 years</w:t>
+      </w:r>
+    </w:p>
+    <w:p/>
+    <w:p>
+      <w:r>
+        <w:t>Projects</w:t>
+      </w:r>
+      <w:r>
+        <w:t>:</w:t>
+      </w:r>
+    </w:p>
+    <w:p>
+      <w:r>
+        <w:t>AI Resume Matcher</w:t>
+      </w:r>
+    </w:p>
+    <w:p>
+      <w:r>
+        <w:t>Customer Churn Prediction</w:t>
       </w:r>
     </w:p>
     <w:sectPr>

</xml_diff>